<commit_message>
created repository and added Task1
</commit_message>
<xml_diff>
--- a/docs/Proiect_IP.docx
+++ b/docs/Proiect_IP.docx
@@ -5,12 +5,13 @@
     <w:p>
       <w:pPr>
         <w:pStyle w:val="Title"/>
-        <w:jc w:val="center"/>
-        <w:rPr>
-          <w:rFonts w:ascii="Times New Roman" w:hAnsi="Times New Roman" w:cs="Times New Roman"/>
-          <w:lang w:val="en-US"/>
-        </w:rPr>
-      </w:pPr>
+        <w:rPr>
+          <w:rFonts w:ascii="Times New Roman" w:hAnsi="Times New Roman" w:cs="Times New Roman"/>
+          <w:lang w:val="en-US"/>
+        </w:rPr>
+      </w:pPr>
+      <w:bookmarkStart w:id="0" w:name="_GoBack"/>
+      <w:bookmarkEnd w:id="0"/>
     </w:p>
     <w:p>
       <w:pPr>
@@ -443,7 +444,11 @@
     <w:sdt>
       <w:sdtPr>
         <w:rPr>
-          <w:rFonts w:ascii="Times New Roman" w:hAnsi="Times New Roman" w:cs="Times New Roman"/>
+          <w:rFonts w:ascii="Times New Roman" w:eastAsiaTheme="minorHAnsi" w:hAnsi="Times New Roman" w:cs="Times New Roman"/>
+          <w:color w:val="auto"/>
+          <w:sz w:val="22"/>
+          <w:szCs w:val="22"/>
+          <w:lang w:val="ro-RO"/>
         </w:rPr>
         <w:id w:val="-1576268192"/>
         <w:docPartObj>
@@ -453,14 +458,9 @@
       </w:sdtPr>
       <w:sdtEndPr>
         <w:rPr>
-          <w:rFonts w:eastAsiaTheme="minorHAnsi"/>
           <w:b/>
           <w:bCs/>
           <w:noProof/>
-          <w:color w:val="auto"/>
-          <w:sz w:val="22"/>
-          <w:szCs w:val="22"/>
-          <w:lang w:val="ro-RO"/>
         </w:rPr>
       </w:sdtEndPr>
       <w:sdtContent>
@@ -777,8 +777,6 @@
         </w:rPr>
         <w:br w:type="page"/>
       </w:r>
-      <w:bookmarkStart w:id="0" w:name="_GoBack"/>
-      <w:bookmarkEnd w:id="0"/>
     </w:p>
     <w:p>
       <w:pPr>
@@ -990,7 +988,7 @@
           <w:rPr>
             <w:noProof/>
           </w:rPr>
-          <w:t>4</w:t>
+          <w:t>5</w:t>
         </w:r>
         <w:r>
           <w:rPr>
@@ -2166,7 +2164,7 @@
 </file>
 
 <file path=customXml/itemProps1.xml><?xml version="1.0" encoding="utf-8"?>
-<ds:datastoreItem xmlns:ds="http://schemas.openxmlformats.org/officeDocument/2006/customXml" ds:itemID="{07A35135-E3C7-457D-B569-6AFEB8A51CFB}">
+<ds:datastoreItem xmlns:ds="http://schemas.openxmlformats.org/officeDocument/2006/customXml" ds:itemID="{19BCAC4E-11C0-47AD-8FAD-891F76E44F00}">
   <ds:schemaRefs>
     <ds:schemaRef ds:uri="http://schemas.openxmlformats.org/officeDocument/2006/bibliography"/>
   </ds:schemaRefs>

</xml_diff>